<commit_message>
Documentation in my own voice, and no em dashes anywhere: README, both narratives, threat model, usage, design notes; the technical post loses its en dashes and one word
Every number and command is unchanged. The two narratives are rewritten first person; the plain-English one now carries the real-model run too. The CC licence text is Creative Commons' own and is left as they wrote it.

Co-Authored-By: Claude Fable 5.1 <noreply@anthropic.com>
Claude-Session: https://claude.ai/code/session_01DkQpVYNjMdJtfzj74tR8ZC
</commit_message>
<xml_diff>
--- a/blog/02-inside-openais-watermark.docx
+++ b/blog/02-inside-openais-watermark.docx
@@ -247,7 +247,7 @@
         <w:rPr>
           <w:rStyle w:val="Hyperlink"/>
         </w:rPr>
-        <w:t>prf.py, lines 72–82</w:t>
+        <w:t>prf.py, lines 72 to 82</w:t>
       </w:r>
       <w:r>
         <w:rPr>
@@ -831,7 +831,7 @@
         <w:rPr>
           <w:rStyle w:val="Hyperlink"/>
         </w:rPr>
-        <w:t>prf.py, lines 84–122</w:t>
+        <w:t>prf.py, lines 84 to 122</w:t>
       </w:r>
       <w:r>
         <w:rPr>
@@ -1449,7 +1449,7 @@
         <w:rPr>
           <w:rStyle w:val="Hyperlink"/>
         </w:rPr>
-        <w:t>ot.py, lines 65–127</w:t>
+        <w:t>ot.py, lines 65 to 127</w:t>
       </w:r>
       <w:r>
         <w:rPr>
@@ -2164,7 +2164,7 @@
         <w:rPr>
           <w:rStyle w:val="Hyperlink"/>
         </w:rPr>
-        <w:t>watermark.py, lines 64–102</w:t>
+        <w:t>watermark.py, lines 64 to 102</w:t>
       </w:r>
       <w:r>
         <w:rPr>
@@ -2884,7 +2884,7 @@
         <w:rPr>
           <w:rStyle w:val="Hyperlink"/>
         </w:rPr>
-        <w:t>detector.py, lines 97–131</w:t>
+        <w:t>detector.py, lines 97 to 131</w:t>
       </w:r>
       <w:r>
         <w:rPr>
@@ -3621,7 +3621,7 @@
         <w:rPr>
           <w:rStyle w:val="Hyperlink"/>
         </w:rPr>
-        <w:t>canonicalize.py, lines 69–77</w:t>
+        <w:t>canonicalize.py, lines 69 to 77</w:t>
       </w:r>
       <w:r>
         <w:rPr>
@@ -3941,7 +3941,7 @@
         <w:rPr>
           <w:rStyle w:val="Hyperlink"/>
         </w:rPr>
-        <w:t>detector.py, lines 137–183</w:t>
+        <w:t>detector.py, lines 137 to 183</w:t>
       </w:r>
       <w:r>
         <w:rPr>
@@ -4317,7 +4317,7 @@
         <w:rPr>
           <w:rStyle w:val="Hyperlink"/>
         </w:rPr>
-        <w:t>retrieval.py, lines 95–140</w:t>
+        <w:t>retrieval.py, lines 95 to 140</w:t>
       </w:r>
       <w:r>
         <w:rPr>
@@ -4385,7 +4385,7 @@
         <w:rPr>
           <w:rStyle w:val="Hyperlink"/>
         </w:rPr>
-        <w:t>registry.py, lines 148–170</w:t>
+        <w:t>registry.py, lines 148 to 170</w:t>
       </w:r>
       <w:r>
         <w:rPr>
@@ -8723,7 +8723,7 @@
       </w:hyperlink>
       <w:r>
         <w:rPr/>
-        <w:t>, which is built to sit on NVIDIA's platform, because that is where the models run. The one after that is the comprehensive silicon design.</w:t>
+        <w:t>, which is built to sit on NVIDIA's platform, because that is where the models run. The one after that is the full silicon design.</w:t>
       </w:r>
       <w:bookmarkEnd w:id="18"/>
     </w:p>

</xml_diff>